<commit_message>
Adopter le repositionnement du cachet depuis le nouveau BV.docx
Le cachet du bureau ordinaire est maintenant ancré dans le paragraphe
"نائب الكاتب" plutôt que dans un paragraphe vide séparé après la date.
bureau_ordinaire.docx est régénéré directement depuis ce fichier ; le
cachet reste préservé intact (image, taille, position) grâce au même
mécanisme qui protège les runs <w:drawing> pendant la reconstruction
des paragraphes.

Co-Authored-By: Claude Sonnet 5 <noreply@anthropic.com>
Claude-Session: https://claude.ai/code/session_01BaHmc9DmpkAm6mxW2kYeWD
</commit_message>
<xml_diff>
--- a/backend/app/templates_word/bureau_ordinaire.docx
+++ b/backend/app/templates_word/bureau_ordinaire.docx
@@ -147,7 +147,7 @@
     </w:p>
     <w:p>
       <w:pPr>
-        <w:pStyle w:val="Paragraphedeliste"/>
+        <w:pStyle w:val="ListParagraph"/>
         <w:numPr>
           <w:ilvl w:val="0"/>
           <w:numId w:val="4"/>
@@ -179,7 +179,7 @@
     </w:p>
     <w:p>
       <w:pPr>
-        <w:pStyle w:val="Paragraphedeliste"/>
+        <w:pStyle w:val="ListParagraph"/>
         <w:numPr>
           <w:ilvl w:val="0"/>
           <w:numId w:val="4"/>
@@ -211,7 +211,7 @@
     </w:p>
     <w:p>
       <w:pPr>
-        <w:pStyle w:val="Paragraphedeliste"/>
+        <w:pStyle w:val="ListParagraph"/>
         <w:numPr>
           <w:ilvl w:val="0"/>
           <w:numId w:val="4"/>
@@ -243,7 +243,7 @@
     </w:p>
     <w:p>
       <w:pPr>
-        <w:pStyle w:val="Paragraphedeliste"/>
+        <w:pStyle w:val="ListParagraph"/>
         <w:numPr>
           <w:ilvl w:val="0"/>
           <w:numId w:val="4"/>
@@ -302,7 +302,7 @@
     </w:p>
     <w:p>
       <w:pPr>
-        <w:pStyle w:val="Normalcentr"/>
+        <w:pStyle w:val="BlockText"/>
         <w:ind w:left="26" w:right="0" w:firstLine="0"/>
         <w:rPr>
           <w:rFonts w:ascii="Sakkal Majalla" w:hAnsi="Sakkal Majalla" w:cs="Sakkal Majalla"/>
@@ -343,7 +343,7 @@
     </w:p>
     <w:p>
       <w:pPr>
-        <w:pStyle w:val="Normalcentr"/>
+        <w:pStyle w:val="BlockText"/>
         <w:ind w:left="26" w:right="0" w:firstLine="540"/>
         <w:rPr>
           <w:rFonts w:ascii="Sakkal Majalla" w:hAnsi="Sakkal Majalla" w:cs="Sakkal Majalla"/>
@@ -354,6 +354,8 @@
           <w:rtl/>
         </w:rPr>
       </w:pPr>
+      <w:proofErr w:type="gramStart"/>
+      <w:proofErr w:type="gramEnd"/>
       <w:r>
         <w:rPr>
           <w:rFonts w:ascii="Sakkal Majalla" w:hAnsi="Sakkal Majalla" w:cs="Sakkal Majalla"/>
@@ -478,7 +480,7 @@
     </w:p>
     <w:p>
       <w:pPr>
-        <w:pStyle w:val="Normalcentr"/>
+        <w:pStyle w:val="BlockText"/>
         <w:ind w:left="26" w:right="0" w:firstLine="0"/>
         <w:rPr>
           <w:rFonts w:ascii="Sakkal Majalla" w:hAnsi="Sakkal Majalla" w:cs="Sakkal Majalla"/>
@@ -511,7 +513,7 @@
     </w:p>
     <w:p>
       <w:pPr>
-        <w:pStyle w:val="Normalcentr"/>
+        <w:pStyle w:val="BlockText"/>
         <w:ind w:left="26" w:right="0" w:firstLine="540"/>
         <w:rPr>
           <w:rFonts w:ascii="Sakkal Majalla" w:hAnsi="Sakkal Majalla" w:cs="Sakkal Majalla"/>
@@ -580,7 +582,7 @@
     </w:p>
     <w:p>
       <w:pPr>
-        <w:pStyle w:val="Normalcentr"/>
+        <w:pStyle w:val="BlockText"/>
         <w:ind w:left="26" w:right="0" w:firstLine="0"/>
         <w:rPr>
           <w:rFonts w:ascii="Sakkal Majalla" w:hAnsi="Sakkal Majalla" w:cs="Sakkal Majalla"/>
@@ -613,7 +615,7 @@
     </w:p>
     <w:p>
       <w:pPr>
-        <w:pStyle w:val="Normalcentr"/>
+        <w:pStyle w:val="BlockText"/>
         <w:ind w:left="26" w:right="0" w:firstLine="540"/>
         <w:rPr>
           <w:rFonts w:ascii="Sakkal Majalla" w:hAnsi="Sakkal Majalla" w:cs="Sakkal Majalla"/>
@@ -638,7 +640,7 @@
     </w:p>
     <w:p>
       <w:pPr>
-        <w:pStyle w:val="Normalcentr"/>
+        <w:pStyle w:val="BlockText"/>
         <w:numPr>
           <w:ilvl w:val="0"/>
           <w:numId w:val="13"/>
@@ -717,7 +719,7 @@
     </w:p>
     <w:p>
       <w:pPr>
-        <w:pStyle w:val="Normalcentr"/>
+        <w:pStyle w:val="BlockText"/>
         <w:numPr>
           <w:ilvl w:val="0"/>
           <w:numId w:val="13"/>
@@ -796,7 +798,7 @@
     </w:p>
     <w:p>
       <w:pPr>
-        <w:pStyle w:val="Normalcentr"/>
+        <w:pStyle w:val="BlockText"/>
         <w:numPr>
           <w:ilvl w:val="0"/>
           <w:numId w:val="13"/>
@@ -875,7 +877,7 @@
     </w:p>
     <w:p>
       <w:pPr>
-        <w:pStyle w:val="Normalcentr"/>
+        <w:pStyle w:val="BlockText"/>
         <w:ind w:left="26" w:right="0" w:firstLine="0"/>
         <w:rPr>
           <w:rFonts w:ascii="Sakkal Majalla" w:hAnsi="Sakkal Majalla" w:cs="Sakkal Majalla"/>
@@ -908,7 +910,7 @@
     </w:p>
     <w:p>
       <w:pPr>
-        <w:pStyle w:val="Normalcentr"/>
+        <w:pStyle w:val="BlockText"/>
         <w:ind w:left="26" w:right="0" w:firstLine="540"/>
         <w:rPr>
           <w:rFonts w:ascii="Sakkal Majalla" w:hAnsi="Sakkal Majalla" w:cs="Sakkal Majalla"/>
@@ -933,7 +935,7 @@
     </w:p>
     <w:p>
       <w:pPr>
-        <w:pStyle w:val="Normalcentr"/>
+        <w:pStyle w:val="BlockText"/>
         <w:numPr>
           <w:ilvl w:val="0"/>
           <w:numId w:val="13"/>
@@ -1007,7 +1009,7 @@
     </w:p>
     <w:p>
       <w:pPr>
-        <w:pStyle w:val="Normalcentr"/>
+        <w:pStyle w:val="BlockText"/>
         <w:numPr>
           <w:ilvl w:val="0"/>
           <w:numId w:val="13"/>
@@ -1081,7 +1083,7 @@
     </w:p>
     <w:p>
       <w:pPr>
-        <w:pStyle w:val="Normalcentr"/>
+        <w:pStyle w:val="BlockText"/>
         <w:numPr>
           <w:ilvl w:val="0"/>
           <w:numId w:val="13"/>
@@ -1098,139 +1100,19 @@
       </w:pPr>
       <w:r>
         <w:rPr>
-          <w:rFonts w:ascii="Sakkal Majalla" w:hAnsi="Sakkal Majalla" w:cs="Sakkal Majalla" w:hint="cs"/>
-          <w:b w:val="0"/>
-          <w:bCs w:val="0"/>
-          <w:sz w:val="28"/>
-          <w:szCs w:val="28"/>
-          <w:rtl/>
-        </w:rPr>
-        <w:t xml:space="preserve">نائب الكاتب: </w:t>
-      </w:r>
-      <w:r>
-        <w:rPr>
-          <w:rFonts w:ascii="Sakkal Majalla" w:hAnsi="Sakkal Majalla" w:cs="Sakkal Majalla" w:hint="cs"/>
-          <w:b w:val="0"/>
-          <w:bCs w:val="0"/>
-          <w:sz w:val="28"/>
-          <w:szCs w:val="28"/>
-          <w:rtl/>
-        </w:rPr>
-        <w:t>{{ suppleant_3 }}</w:t>
-      </w:r>
-      <w:r>
-        <w:rPr>
-          <w:rFonts w:ascii="Sakkal Majalla" w:hAnsi="Sakkal Majalla" w:cs="Sakkal Majalla" w:hint="cs"/>
-          <w:b w:val="0"/>
-          <w:bCs w:val="0"/>
-          <w:sz w:val="28"/>
-          <w:szCs w:val="28"/>
-          <w:rtl/>
-        </w:rPr>
-        <w:t xml:space="preserve"> الحامل لبطاقة التعريف الوطنية رقم </w:t>
-      </w:r>
-      <w:r>
-        <w:rPr>
-          <w:rFonts w:ascii="Sakkal Majalla" w:hAnsi="Sakkal Majalla" w:cs="Sakkal Majalla" w:hint="cs"/>
-          <w:b w:val="0"/>
-          <w:bCs w:val="0"/>
-          <w:sz w:val="28"/>
-          <w:szCs w:val="28"/>
-          <w:rtl/>
-        </w:rPr>
-        <w:t>{{ suppleant_3_cin }}</w:t>
-      </w:r>
-      <w:r>
-        <w:rPr>
-          <w:rFonts w:ascii="Sakkal Majalla" w:hAnsi="Sakkal Majalla" w:cs="Sakkal Majalla" w:hint="cs"/>
-          <w:b w:val="0"/>
-          <w:bCs w:val="0"/>
-          <w:sz w:val="28"/>
-          <w:szCs w:val="28"/>
-          <w:rtl/>
-        </w:rPr>
-        <w:t>،</w:t>
-      </w:r>
-    </w:p>
-    <w:p>
-      <w:pPr>
-        <w:pStyle w:val="Normalcentr"/>
-        <w:ind w:left="1466" w:right="0" w:firstLine="0"/>
-        <w:rPr>
-          <w:rFonts w:ascii="Sakkal Majalla" w:hAnsi="Sakkal Majalla" w:cs="Sakkal Majalla"/>
-          <w:b w:val="0"/>
-          <w:bCs w:val="0"/>
-          <w:sz w:val="28"/>
-          <w:szCs w:val="28"/>
-          <w:rtl/>
-          <w:lang w:val="fr-MA"/>
-        </w:rPr>
-      </w:pPr>
-    </w:p>
-    <w:p>
-      <w:pPr>
-        <w:pStyle w:val="Normalcentr"/>
-        <w:ind w:left="26" w:right="0" w:firstLine="720"/>
-        <w:jc w:val="right"/>
-        <w:rPr>
-          <w:rFonts w:ascii="Andalus" w:hAnsi="Andalus"/>
-          <w:b w:val="0"/>
-          <w:bCs w:val="0"/>
-          <w:sz w:val="26"/>
-          <w:szCs w:val="26"/>
-          <w:rtl/>
-        </w:rPr>
-      </w:pPr>
-      <w:r>
-        <w:rPr>
-          <w:rFonts w:ascii="Andalus" w:hAnsi="Andalus"/>
-          <w:b w:val="0"/>
-          <w:bCs w:val="0"/>
-          <w:sz w:val="26"/>
-          <w:szCs w:val="26"/>
-          <w:rtl/>
-        </w:rPr>
-        <w:t xml:space="preserve">الداخلة في: </w:t>
-      </w:r>
-      <w:r>
-        <w:rPr>
-          <w:rFonts w:ascii="Andalus" w:hAnsi="Andalus"/>
-          <w:b w:val="0"/>
-          <w:bCs w:val="0"/>
-          <w:sz w:val="26"/>
-          <w:szCs w:val="26"/>
-          <w:rtl/>
-        </w:rPr>
-        <w:t>{{ date_signature }}</w:t>
-      </w:r>
-    </w:p>
-    <w:p>
-      <w:pPr>
-        <w:pStyle w:val="Normalcentr"/>
-        <w:ind w:left="26" w:right="0" w:firstLine="720"/>
-        <w:jc w:val="right"/>
-        <w:rPr>
-          <w:rFonts w:ascii="Andalus" w:hAnsi="Andalus"/>
-          <w:sz w:val="26"/>
-          <w:szCs w:val="26"/>
-          <w:rtl/>
-        </w:rPr>
-      </w:pPr>
-      <w:r>
-        <w:rPr>
           <w:rFonts w:ascii="Andalus" w:hAnsi="Andalus"/>
           <w:noProof/>
           <w:sz w:val="26"/>
           <w:szCs w:val="26"/>
         </w:rPr>
         <w:drawing>
-          <wp:anchor distT="0" distB="0" distL="114300" distR="114300" simplePos="0" relativeHeight="251663360" behindDoc="0" locked="0" layoutInCell="1" allowOverlap="1" wp14:anchorId="754720D2" wp14:editId="11DA3660">
+          <wp:anchor distT="0" distB="0" distL="114300" distR="114300" simplePos="0" relativeHeight="251659264" behindDoc="0" locked="0" layoutInCell="1" allowOverlap="1" wp14:anchorId="0EBF5F59" wp14:editId="3D004BCE">
             <wp:simplePos x="0" y="0"/>
             <wp:positionH relativeFrom="column">
-              <wp:posOffset>-249555</wp:posOffset>
+              <wp:posOffset>-238125</wp:posOffset>
             </wp:positionH>
             <wp:positionV relativeFrom="paragraph">
-              <wp:posOffset>168275</wp:posOffset>
+              <wp:posOffset>280670</wp:posOffset>
             </wp:positionV>
             <wp:extent cx="2609850" cy="1412875"/>
             <wp:effectExtent l="0" t="0" r="0" b="0"/>
@@ -1247,7 +1129,7 @@
                     <pic:cNvPicPr/>
                   </pic:nvPicPr>
                   <pic:blipFill>
-                    <a:blip r:embed="rId12">
+                    <a:blip r:embed="rId8">
                       <a:extLst>
                         <a:ext uri="{28A0092B-C50C-407E-A947-70E740481C1C}">
                           <a14:useLocalDpi xmlns:a14="http://schemas.microsoft.com/office/drawing/2010/main" val="0"/>
@@ -1279,10 +1161,115 @@
           </wp:anchor>
         </w:drawing>
       </w:r>
+      <w:r>
+        <w:rPr>
+          <w:rFonts w:ascii="Sakkal Majalla" w:hAnsi="Sakkal Majalla" w:cs="Sakkal Majalla" w:hint="cs"/>
+          <w:b w:val="0"/>
+          <w:bCs w:val="0"/>
+          <w:sz w:val="28"/>
+          <w:szCs w:val="28"/>
+          <w:rtl/>
+        </w:rPr>
+        <w:t xml:space="preserve">نائب الكاتب: </w:t>
+      </w:r>
+      <w:r>
+        <w:rPr>
+          <w:rFonts w:ascii="Sakkal Majalla" w:hAnsi="Sakkal Majalla" w:cs="Sakkal Majalla" w:hint="cs"/>
+          <w:b w:val="0"/>
+          <w:bCs w:val="0"/>
+          <w:sz w:val="28"/>
+          <w:szCs w:val="28"/>
+          <w:rtl/>
+        </w:rPr>
+        <w:t>{{ suppleant_3 }}</w:t>
+      </w:r>
+      <w:r>
+        <w:rPr>
+          <w:rFonts w:ascii="Sakkal Majalla" w:hAnsi="Sakkal Majalla" w:cs="Sakkal Majalla" w:hint="cs"/>
+          <w:b w:val="0"/>
+          <w:bCs w:val="0"/>
+          <w:sz w:val="28"/>
+          <w:szCs w:val="28"/>
+          <w:rtl/>
+        </w:rPr>
+        <w:t xml:space="preserve"> الحامل لبطاقة التعريف الوطنية رقم </w:t>
+      </w:r>
+      <w:r>
+        <w:rPr>
+          <w:rFonts w:ascii="Sakkal Majalla" w:hAnsi="Sakkal Majalla" w:cs="Sakkal Majalla" w:hint="cs"/>
+          <w:b w:val="0"/>
+          <w:bCs w:val="0"/>
+          <w:sz w:val="28"/>
+          <w:szCs w:val="28"/>
+          <w:rtl/>
+        </w:rPr>
+        <w:t>{{ suppleant_3_cin }}</w:t>
+      </w:r>
+      <w:r>
+        <w:rPr>
+          <w:rFonts w:ascii="Sakkal Majalla" w:hAnsi="Sakkal Majalla" w:cs="Sakkal Majalla" w:hint="cs"/>
+          <w:b w:val="0"/>
+          <w:bCs w:val="0"/>
+          <w:sz w:val="28"/>
+          <w:szCs w:val="28"/>
+          <w:rtl/>
+        </w:rPr>
+        <w:t>،</w:t>
+      </w:r>
     </w:p>
     <w:p>
       <w:pPr>
-        <w:pStyle w:val="Normalcentr"/>
+        <w:pStyle w:val="BlockText"/>
+        <w:ind w:left="26" w:right="0" w:firstLine="720"/>
+        <w:jc w:val="right"/>
+        <w:rPr>
+          <w:rFonts w:ascii="Andalus" w:hAnsi="Andalus"/>
+          <w:b w:val="0"/>
+          <w:bCs w:val="0"/>
+          <w:sz w:val="26"/>
+          <w:szCs w:val="26"/>
+          <w:rtl/>
+        </w:rPr>
+      </w:pPr>
+      <w:r>
+        <w:rPr>
+          <w:rFonts w:ascii="Andalus" w:hAnsi="Andalus"/>
+          <w:b w:val="0"/>
+          <w:bCs w:val="0"/>
+          <w:sz w:val="26"/>
+          <w:szCs w:val="26"/>
+          <w:rtl/>
+        </w:rPr>
+        <w:t xml:space="preserve">الداخلة في: </w:t>
+      </w:r>
+      <w:r>
+        <w:rPr>
+          <w:rFonts w:ascii="Andalus" w:hAnsi="Andalus"/>
+          <w:b w:val="0"/>
+          <w:bCs w:val="0"/>
+          <w:sz w:val="26"/>
+          <w:szCs w:val="26"/>
+          <w:rtl/>
+        </w:rPr>
+        <w:t>{{ date_signature }}</w:t>
+      </w:r>
+    </w:p>
+    <w:p>
+      <w:pPr>
+        <w:pStyle w:val="BlockText"/>
+        <w:ind w:left="26" w:right="0" w:firstLine="720"/>
+        <w:jc w:val="right"/>
+        <w:rPr>
+          <w:rFonts w:ascii="Andalus" w:hAnsi="Andalus"/>
+          <w:sz w:val="26"/>
+          <w:szCs w:val="26"/>
+          <w:rtl/>
+        </w:rPr>
+      </w:pPr>
+    </w:p>
+    <w:p>
+      <w:pPr>
+        <w:pStyle w:val="BlockText"/>
         <w:ind w:left="26" w:right="0" w:firstLine="720"/>
         <w:jc w:val="right"/>
         <w:rPr>
@@ -1299,24 +1286,13 @@
           <w:tab w:val="right" w:pos="9341"/>
         </w:tabs>
         <w:bidi/>
-        <w:ind w:left="-808" w:firstLine="808"/>
-        <w:jc w:val="right"/>
-        <w:rPr>
-          <w:rFonts w:ascii="Sakkal Majalla" w:hAnsi="Sakkal Majalla" w:cs="Sakkal Majalla"/>
-          <w:sz w:val="28"/>
-          <w:szCs w:val="28"/>
-          <w:rtl/>
-        </w:rPr>
-      </w:pPr>
-      <w:r>
-        <w:rPr>
-          <w:rFonts w:ascii="Andalus" w:eastAsia="Times New Roman" w:hAnsi="Andalus" w:cs="Andalus"/>
-          <w:sz w:val="26"/>
-          <w:szCs w:val="26"/>
-          <w:lang w:bidi="ar-MA"/>
-        </w:rPr>
-        <w:t xml:space="preserve"> </w:t>
-      </w:r>
+        <w:rPr>
+          <w:rFonts w:ascii="Sakkal Majalla" w:hAnsi="Sakkal Majalla" w:cs="Sakkal Majalla"/>
+          <w:sz w:val="28"/>
+          <w:szCs w:val="28"/>
+          <w:rtl/>
+        </w:rPr>
+      </w:pPr>
     </w:p>
     <w:sectPr>
       <w:headerReference w:type="default" r:id="rId9"/>
@@ -1389,7 +1365,7 @@
 <w:hdr xmlns:wpc="http://schemas.microsoft.com/office/word/2010/wordprocessingCanvas" xmlns:cx="http://schemas.microsoft.com/office/drawing/2014/chartex" xmlns:cx1="http://schemas.microsoft.com/office/drawing/2015/9/8/chartex" xmlns:cx2="http://schemas.microsoft.com/office/drawing/2015/10/21/chartex" xmlns:cx3="http://schemas.microsoft.com/office/drawing/2016/5/9/chartex" xmlns:cx4="http://schemas.microsoft.com/office/drawing/2016/5/10/chartex" xmlns:cx5="http://schemas.microsoft.com/office/drawing/2016/5/11/chartex" xmlns:cx6="http://schemas.microsoft.com/office/drawing/2016/5/12/chartex" xmlns:cx7="http://schemas.microsoft.com/office/drawing/2016/5/13/chartex" xmlns:cx8="http://schemas.microsoft.com/office/drawing/2016/5/14/chartex" xmlns:mc="http://schemas.openxmlformats.org/markup-compatibility/2006" xmlns:aink="http://schemas.microsoft.com/office/drawing/2016/ink" xmlns:am3d="http://schemas.microsoft.com/office/drawing/2017/model3d" xmlns:o="urn:schemas-microsoft-com:office:office" xmlns:oel="http://schemas.microsoft.com/office/2019/extlst" xmlns:r="http://schemas.openxmlformats.org/officeDocument/2006/relationships" xmlns:m="http://schemas.openxmlformats.org/officeDocument/2006/math" xmlns:v="urn:schemas-microsoft-com:vml" xmlns:wp14="http://schemas.microsoft.com/office/word/2010/wordprocessingDrawing" xmlns:wp="http://schemas.openxmlformats.org/drawingml/2006/wordprocessingDrawing" xmlns:w10="urn:schemas-microsoft-com:office:word" xmlns:w="http://schemas.openxmlformats.org/wordprocessingml/2006/main" xmlns:w14="http://schemas.microsoft.com/office/word/2010/wordml" xmlns:w15="http://schemas.microsoft.com/office/word/2012/wordml" xmlns:w16cex="http://schemas.microsoft.com/office/word/2018/wordml/cex" xmlns:w16cid="http://schemas.microsoft.com/office/word/2016/wordml/cid" xmlns:w16="http://schemas.microsoft.com/office/word/2018/wordml" xmlns:w16du="http://schemas.microsoft.com/office/word/2023/wordml/word16du" xmlns:w16sdtdh="http://schemas.microsoft.com/office/word/2020/wordml/sdtdatahash" xmlns:w16sdtfl="http://schemas.microsoft.com/office/word/2024/wordml/sdtformatlock" xmlns:w16se="http://schemas.microsoft.com/office/word/2015/wordml/symex" xmlns:wpg="http://schemas.microsoft.com/office/word/2010/wordprocessingGroup" xmlns:wpi="http://schemas.microsoft.com/office/word/2010/wordprocessingInk" xmlns:wne="http://schemas.microsoft.com/office/word/2006/wordml" xmlns:wps="http://schemas.microsoft.com/office/word/2010/wordprocessingShape" mc:Ignorable="w14 w15 w16se w16cid w16 w16cex w16sdtdh w16sdtfl w16du wp14">
   <w:p>
     <w:pPr>
-      <w:pStyle w:val="En-tte"/>
+      <w:pStyle w:val="Header"/>
       <w:jc w:val="center"/>
     </w:pPr>
     <w:r>
@@ -3887,13 +3863,13 @@
     <w:qFormat/>
     <w:rsid w:val="00925F60"/>
   </w:style>
-  <w:style w:type="character" w:default="1" w:styleId="Policepardfaut">
+  <w:style w:type="character" w:default="1" w:styleId="DefaultParagraphFont">
     <w:name w:val="Default Paragraph Font"/>
     <w:uiPriority w:val="1"/>
     <w:semiHidden/>
     <w:unhideWhenUsed/>
   </w:style>
-  <w:style w:type="table" w:default="1" w:styleId="TableauNormal">
+  <w:style w:type="table" w:default="1" w:styleId="TableNormal">
     <w:name w:val="Normal Table"/>
     <w:uiPriority w:val="99"/>
     <w:semiHidden/>
@@ -3908,15 +3884,15 @@
       </w:tblCellMar>
     </w:tblPr>
   </w:style>
-  <w:style w:type="numbering" w:default="1" w:styleId="Aucuneliste">
+  <w:style w:type="numbering" w:default="1" w:styleId="NoList">
     <w:name w:val="No List"/>
     <w:uiPriority w:val="99"/>
     <w:semiHidden/>
     <w:unhideWhenUsed/>
   </w:style>
-  <w:style w:type="table" w:styleId="Grilledutableau">
+  <w:style w:type="table" w:styleId="TableGrid">
     <w:name w:val="Table Grid"/>
-    <w:basedOn w:val="TableauNormal"/>
+    <w:basedOn w:val="TableNormal"/>
     <w:uiPriority w:val="59"/>
     <w:rsid w:val="00045DC0"/>
     <w:pPr>
@@ -3933,10 +3909,10 @@
       </w:tblBorders>
     </w:tblPr>
   </w:style>
-  <w:style w:type="paragraph" w:styleId="En-tte">
+  <w:style w:type="paragraph" w:styleId="Header">
     <w:name w:val="header"/>
     <w:basedOn w:val="Normal"/>
-    <w:link w:val="En-tteCar"/>
+    <w:link w:val="HeaderChar"/>
     <w:uiPriority w:val="99"/>
     <w:semiHidden/>
     <w:unhideWhenUsed/>
@@ -3949,18 +3925,18 @@
       <w:spacing w:after="0" w:line="240" w:lineRule="auto"/>
     </w:pPr>
   </w:style>
-  <w:style w:type="character" w:customStyle="1" w:styleId="En-tteCar">
-    <w:name w:val="En-tête Car"/>
-    <w:basedOn w:val="Policepardfaut"/>
-    <w:link w:val="En-tte"/>
+  <w:style w:type="character" w:customStyle="1" w:styleId="HeaderChar">
+    <w:name w:val="Header Char"/>
+    <w:basedOn w:val="DefaultParagraphFont"/>
+    <w:link w:val="Header"/>
     <w:uiPriority w:val="99"/>
     <w:semiHidden/>
     <w:rsid w:val="002B4646"/>
   </w:style>
-  <w:style w:type="paragraph" w:styleId="Pieddepage">
+  <w:style w:type="paragraph" w:styleId="Footer">
     <w:name w:val="footer"/>
     <w:basedOn w:val="Normal"/>
-    <w:link w:val="PieddepageCar"/>
+    <w:link w:val="FooterChar"/>
     <w:uiPriority w:val="99"/>
     <w:semiHidden/>
     <w:unhideWhenUsed/>
@@ -3973,15 +3949,15 @@
       <w:spacing w:after="0" w:line="240" w:lineRule="auto"/>
     </w:pPr>
   </w:style>
-  <w:style w:type="character" w:customStyle="1" w:styleId="PieddepageCar">
-    <w:name w:val="Pied de page Car"/>
-    <w:basedOn w:val="Policepardfaut"/>
-    <w:link w:val="Pieddepage"/>
+  <w:style w:type="character" w:customStyle="1" w:styleId="FooterChar">
+    <w:name w:val="Footer Char"/>
+    <w:basedOn w:val="DefaultParagraphFont"/>
+    <w:link w:val="Footer"/>
     <w:uiPriority w:val="99"/>
     <w:semiHidden/>
     <w:rsid w:val="002B4646"/>
   </w:style>
-  <w:style w:type="paragraph" w:styleId="Paragraphedeliste">
+  <w:style w:type="paragraph" w:styleId="ListParagraph">
     <w:name w:val="List Paragraph"/>
     <w:basedOn w:val="Normal"/>
     <w:uiPriority w:val="34"/>
@@ -3992,10 +3968,10 @@
       <w:contextualSpacing/>
     </w:pPr>
   </w:style>
-  <w:style w:type="paragraph" w:styleId="Titre">
+  <w:style w:type="paragraph" w:styleId="Title">
     <w:name w:val="Title"/>
     <w:basedOn w:val="Normal"/>
-    <w:link w:val="TitreCar"/>
+    <w:link w:val="TitleChar"/>
     <w:qFormat/>
     <w:rsid w:val="008F1194"/>
     <w:pPr>
@@ -4013,10 +3989,10 @@
       <w:lang w:bidi="ar-MA"/>
     </w:rPr>
   </w:style>
-  <w:style w:type="character" w:customStyle="1" w:styleId="TitreCar">
-    <w:name w:val="Titre Car"/>
-    <w:basedOn w:val="Policepardfaut"/>
-    <w:link w:val="Titre"/>
+  <w:style w:type="character" w:customStyle="1" w:styleId="TitleChar">
+    <w:name w:val="Title Char"/>
+    <w:basedOn w:val="DefaultParagraphFont"/>
+    <w:link w:val="Title"/>
     <w:rsid w:val="008F1194"/>
     <w:rPr>
       <w:rFonts w:ascii="Times New Roman" w:eastAsia="Times New Roman" w:hAnsi="Times New Roman" w:cs="Traditional Arabic"/>
@@ -4028,10 +4004,10 @@
       <w:lang w:bidi="ar-MA"/>
     </w:rPr>
   </w:style>
-  <w:style w:type="paragraph" w:styleId="Textedebulles">
+  <w:style w:type="paragraph" w:styleId="BalloonText">
     <w:name w:val="Balloon Text"/>
     <w:basedOn w:val="Normal"/>
-    <w:link w:val="TextedebullesCar"/>
+    <w:link w:val="BalloonTextChar"/>
     <w:uiPriority w:val="99"/>
     <w:semiHidden/>
     <w:unhideWhenUsed/>
@@ -4045,10 +4021,10 @@
       <w:szCs w:val="18"/>
     </w:rPr>
   </w:style>
-  <w:style w:type="character" w:customStyle="1" w:styleId="TextedebullesCar">
-    <w:name w:val="Texte de bulles Car"/>
-    <w:basedOn w:val="Policepardfaut"/>
-    <w:link w:val="Textedebulles"/>
+  <w:style w:type="character" w:customStyle="1" w:styleId="BalloonTextChar">
+    <w:name w:val="Balloon Text Char"/>
+    <w:basedOn w:val="DefaultParagraphFont"/>
+    <w:link w:val="BalloonText"/>
     <w:uiPriority w:val="99"/>
     <w:semiHidden/>
     <w:rsid w:val="00724EB2"/>
@@ -4058,9 +4034,9 @@
       <w:szCs w:val="18"/>
     </w:rPr>
   </w:style>
-  <w:style w:type="character" w:styleId="Lienhypertexte">
+  <w:style w:type="character" w:styleId="Hyperlink">
     <w:name w:val="Hyperlink"/>
-    <w:basedOn w:val="Policepardfaut"/>
+    <w:basedOn w:val="DefaultParagraphFont"/>
     <w:uiPriority w:val="99"/>
     <w:semiHidden/>
     <w:unhideWhenUsed/>
@@ -4070,7 +4046,7 @@
       <w:u w:val="single"/>
     </w:rPr>
   </w:style>
-  <w:style w:type="paragraph" w:styleId="Normalcentr">
+  <w:style w:type="paragraph" w:styleId="BlockText">
     <w:name w:val="Block Text"/>
     <w:basedOn w:val="Normal"/>
     <w:rsid w:val="0013093E"/>

</xml_diff>